<commit_message>
docs: anexo H (registro fotográfico con pies de figura) + informe actualizado
- Nuevo docs/Anexo_H_Registro_Fotografico_Aplicacion.docx: 8 capturas de la
  plataforma con pie de figura descriptivo y referencia al entregable que
  evidencian, sobre la plantilla institucional (membrete con logos).
- Informe de avance regenerado: sección 7 referencia el Anexo H.
- Se incorpora el insumo original 'Anexo Imagenes.docx' al expediente.

Co-Authored-By: Claude Fable 5 <noreply@anthropic.com>
</commit_message>
<xml_diff>
--- a/docs/Informe_Avance_Contrato_324_Geodatabase.docx
+++ b/docs/Informe_Avance_Contrato_324_Geodatabase.docx
@@ -3911,6 +3911,15 @@
       </w:pPr>
       <w:r>
         <w:t xml:space="preserve">–  Anexo G. Registro de cambios y verificaciones (09-CAMBIOS.md).</w:t>
+      </w:r>
+    </w:p>
+    <w:p>
+      <w:pPr>
+        <w:spacing w:after="60"/>
+        <w:ind w:left="360"/>
+      </w:pPr>
+      <w:r>
+        <w:t xml:space="preserve">–  Anexo H. Registro fotográfico de la aplicación en funcionamiento (docs/Anexo_H_Registro_Fotografico_Aplicacion.docx): 8 capturas con pie de figura que evidencian autenticación, geovisor con ortofoto, reportes, registro de monitoreos, importación de datos, comparación temporal y consulta espacial.</w:t>
       </w:r>
     </w:p>
     <w:sectPr>

</xml_diff>